<commit_message>
refactor docs: Modificación del Diagrama de Navegación
Se realizaron las correcciones solicitadas
</commit_message>
<xml_diff>
--- a/Fase#1/Modelo de Navegación/Diagrama de Navegación.docx
+++ b/Fase#1/Modelo de Navegación/Diagrama de Navegación.docx
@@ -4,27 +4,60 @@
   <w:body>
     <w:p>
       <w:pPr>
+        <w:jc w:val="center"/>
         <w:rPr>
-          <w:lang w:val="en-US"/>
+          <w:rFonts w:ascii="Arial" w:hAnsi="Arial" w:cs="Arial"/>
+          <w:b/>
+          <w:bCs/>
+          <w:noProof/>
+          <w:sz w:val="24"/>
+          <w:szCs w:val="24"/>
         </w:rPr>
       </w:pPr>
+      <w:r>
+        <w:rPr>
+          <w:rFonts w:ascii="Arial" w:hAnsi="Arial" w:cs="Arial"/>
+          <w:b/>
+          <w:bCs/>
+          <w:noProof/>
+          <w:sz w:val="24"/>
+          <w:szCs w:val="24"/>
+        </w:rPr>
+        <w:t>Diagrama de Navegación del S</w:t>
+      </w:r>
+      <w:r>
+        <w:rPr>
+          <w:rFonts w:ascii="Arial" w:hAnsi="Arial" w:cs="Arial"/>
+          <w:b/>
+          <w:bCs/>
+          <w:noProof/>
+          <w:sz w:val="24"/>
+          <w:szCs w:val="24"/>
+        </w:rPr>
+        <w:t>itio “Tutorías UTDP”</w:t>
+      </w:r>
     </w:p>
     <w:p>
       <w:pPr>
         <w:jc w:val="center"/>
         <w:rPr>
-          <w:lang w:val="en-US"/>
+          <w:rFonts w:ascii="Arial" w:hAnsi="Arial" w:cs="Arial"/>
+          <w:sz w:val="24"/>
+          <w:szCs w:val="24"/>
         </w:rPr>
       </w:pPr>
       <w:r>
         <w:rPr>
-          <w:lang w:val="en-US"/>
+          <w:rFonts w:ascii="Arial" w:hAnsi="Arial" w:cs="Arial"/>
+          <w:noProof/>
+          <w:sz w:val="24"/>
+          <w:szCs w:val="24"/>
         </w:rPr>
         <w:drawing>
-          <wp:inline distT="0" distB="0" distL="0" distR="0" wp14:anchorId="00BA15EB" wp14:editId="33D5FEE4">
-            <wp:extent cx="5943600" cy="3568065"/>
+          <wp:inline distT="0" distB="0" distL="0" distR="0" wp14:anchorId="20036CFE" wp14:editId="3E78FDCD">
+            <wp:extent cx="6400800" cy="4667934"/>
             <wp:effectExtent l="0" t="0" r="0" b="0"/>
-            <wp:docPr id="424344244" name="Imagen 4"/>
+            <wp:docPr id="566557452" name="Imagen 1"/>
             <wp:cNvGraphicFramePr>
               <a:graphicFrameLocks xmlns:a="http://schemas.openxmlformats.org/drawingml/2006/main" noChangeAspect="1"/>
             </wp:cNvGraphicFramePr>
@@ -32,10 +65,8 @@
               <a:graphicData uri="http://schemas.openxmlformats.org/drawingml/2006/picture">
                 <pic:pic xmlns:pic="http://schemas.openxmlformats.org/drawingml/2006/picture">
                   <pic:nvPicPr>
-                    <pic:cNvPr id="0" name="Picture 13"/>
-                    <pic:cNvPicPr>
-                      <a:picLocks noChangeAspect="1" noChangeArrowheads="1"/>
-                    </pic:cNvPicPr>
+                    <pic:cNvPr id="566557452" name="Imagen 566557452"/>
+                    <pic:cNvPicPr/>
                   </pic:nvPicPr>
                   <pic:blipFill>
                     <a:blip r:embed="rId4">
@@ -45,23 +76,18 @@
                         </a:ext>
                       </a:extLst>
                     </a:blip>
-                    <a:srcRect/>
                     <a:stretch>
                       <a:fillRect/>
                     </a:stretch>
                   </pic:blipFill>
-                  <pic:spPr bwMode="auto">
+                  <pic:spPr>
                     <a:xfrm>
                       <a:off x="0" y="0"/>
-                      <a:ext cx="5943600" cy="3568065"/>
+                      <a:ext cx="6403281" cy="4669743"/>
                     </a:xfrm>
                     <a:prstGeom prst="rect">
                       <a:avLst/>
                     </a:prstGeom>
-                    <a:noFill/>
-                    <a:ln>
-                      <a:noFill/>
-                    </a:ln>
                   </pic:spPr>
                 </pic:pic>
               </a:graphicData>
@@ -70,13 +96,8 @@
         </w:drawing>
       </w:r>
     </w:p>
-    <w:p>
-      <w:pPr>
-        <w:rPr>
-          <w:lang w:val="en-US"/>
-        </w:rPr>
-      </w:pPr>
-    </w:p>
+    <w:p/>
+    <w:p/>
     <w:p/>
     <w:sectPr>
       <w:pgSz w:w="12240" w:h="15840"/>
@@ -488,6 +509,7 @@
   <w:style w:type="paragraph" w:default="1" w:styleId="Normal">
     <w:name w:val="Normal"/>
     <w:qFormat/>
+    <w:rsid w:val="00CF10A5"/>
     <w:rPr>
       <w:lang w:val="es-PA"/>
     </w:rPr>
@@ -694,6 +716,7 @@
   <w:style w:type="character" w:default="1" w:styleId="Fuentedeprrafopredeter">
     <w:name w:val="Default Paragraph Font"/>
     <w:uiPriority w:val="1"/>
+    <w:semiHidden/>
     <w:unhideWhenUsed/>
   </w:style>
   <w:style w:type="table" w:default="1" w:styleId="Tablanormal">

</xml_diff>